<commit_message>
5 files changed, 344 insertions(+), 9 deletions(-)
</commit_message>
<xml_diff>
--- a/backend/apps/analysis/static_templates/cot_starter_template.docx
+++ b/backend/apps/analysis/static_templates/cot_starter_template.docx
@@ -652,6 +652,45 @@
         <w:t>{{ narrative }}</w:t>
       </w:r>
     </w:p>
+    <w:p>
+      <w:r>
+        <w:t>{%p if notes %}</w:t>
+      </w:r>
+    </w:p>
+    <w:p>
+      <w:r>
+        <w:rPr>
+          <w:rFonts w:ascii="Arial" w:hAnsi="Arial"/>
+          <w:b/>
+          <w:sz w:val="22"/>
+        </w:rPr>
+        <w:t>Notes</w:t>
+      </w:r>
+    </w:p>
+    <w:p>
+      <w:r>
+        <w:t>{%p for note in notes %}</w:t>
+      </w:r>
+    </w:p>
+    <w:p>
+      <w:r>
+        <w:rPr>
+          <w:rFonts w:ascii="Arial" w:hAnsi="Arial"/>
+          <w:sz w:val="20"/>
+        </w:rPr>
+        <w:t>• {{ note.text }}{% if note.page %} (p.{{ note.page }}){% endif %}</w:t>
+      </w:r>
+    </w:p>
+    <w:p>
+      <w:r>
+        <w:t>{%p endfor %}</w:t>
+      </w:r>
+    </w:p>
+    <w:p>
+      <w:r>
+        <w:t>{%p endif %}</w:t>
+      </w:r>
+    </w:p>
     <w:sectPr>
       <w:footerReference w:type="default" r:id="rId9"/>
       <w:pgSz w:w="12240" w:h="15840"/>

</xml_diff>